<commit_message>
fix: 8 bugs from GPT-5.6-Sol smoke-test audit
Default-path fixes (4):
- Bare dataclass default: output/docx -> output/document.docx (schema.py)
- Bare config Pandoc default: True -> False, matching template behavior
- init without --md-file now creates stub markdown, not invalid project
- Pure Python backend now applies first_line_indent from config

Backend-parity fixes (1):
- Pandoc: remove existing tblW/tblLayout before writing, avoid duplicates

Environment/path fixes (3):
- Relative project.root resolved against YAML dir, not CWD
- Converter paths now consistently use resolved project root
- Pandoc resource-path follows same resolution

Co-Authored-By: GPT-5.6-Sol (via Codex CLI) <noreply@openai.com>
</commit_message>
<xml_diff>
--- a/_screenshots/report_docx/output/report_demo.docx
+++ b/_screenshots/report_docx/output/report_demo.docx
@@ -536,6 +536,8 @@
           <w:insideH w:val="single" w:sz="4" w:space="0" w:color="auto"/>
           <w:insideV w:val="single" w:sz="4" w:space="0" w:color="auto"/>
         </w:tblBorders>
+        <w:tblW w:w="5000" w:type="pct"/>
+        <w:tblLayout w:type="autofit"/>
       </w:tblPr>
       <w:tblGrid>
         <w:gridCol w:w="1980"/>
@@ -971,6 +973,8 @@
           <w:insideH w:val="single" w:sz="4" w:space="0" w:color="auto"/>
           <w:insideV w:val="single" w:sz="4" w:space="0" w:color="auto"/>
         </w:tblBorders>
+        <w:tblW w:w="5000" w:type="pct"/>
+        <w:tblLayout w:type="autofit"/>
       </w:tblPr>
       <w:tblGrid>
         <w:gridCol w:w="1980"/>
@@ -2648,6 +2652,8 @@
           <w:insideH w:val="single" w:sz="4" w:space="0" w:color="auto"/>
           <w:insideV w:val="single" w:sz="4" w:space="0" w:color="auto"/>
         </w:tblBorders>
+        <w:tblW w:w="5000" w:type="pct"/>
+        <w:tblLayout w:type="autofit"/>
       </w:tblPr>
       <w:tblGrid>
         <w:gridCol w:w="2640"/>

</xml_diff>